<commit_message>
Adjust 24-lesson plan for 6-year-old K3 learners who already know letter names
Co-authored-by: Francis <earthonliner@users.noreply.github.com>
</commit_message>
<xml_diff>
--- a/lesson-plans/our-world-starter-phonics-24-lessons.docx
+++ b/lesson-plans/our-world-starter-phonics-24-lessons.docx
@@ -28,7 +28,95 @@
           <w:color w:val="666666"/>
           <w:sz w:val="21"/>
         </w:rPr>
-        <w:t>每课 90 分钟 = Starter 主课 45 分钟 ＋ 自然拼读与游戏 25 分钟 ＋ 绘本共读 20 分钟｜共 24 课，含期中（L12）、期末（L24）｜6 本绘本，每本 3–4 课读完，课后朗读打卡</w:t>
+        <w:t>适用对象：深圳宝安区幼儿园大班 · 6 岁 · 已认识 26 个字母名｜每课 90 分钟 = Starter 主课 45 分钟 ＋ 自然拼读与游戏 25 分钟 ＋ 绘本共读 20 分钟｜共 24 课，含期中（L12）、期末（L24）｜6 本绘本，每本 3–4 课读完，课后朗读打卡</w:t>
+      </w:r>
+    </w:p>
+    <w:p>
+      <w:pPr>
+        <w:spacing w:before="200" w:after="80"/>
+        <w:pBdr>
+          <w:bottom w:val="single" w:sz="6" w:space="1" w:color="1F5F9E"/>
+        </w:pBdr>
+      </w:pPr>
+      <w:r>
+        <w:rPr>
+          <w:b/>
+          <w:color w:val="1F5F9E"/>
+          <w:sz w:val="26"/>
+        </w:rPr>
+        <w:t>零、学情分析：宝安区大班（6 岁）孩子的英语起点</w:t>
+      </w:r>
+    </w:p>
+    <w:p>
+      <w:pPr>
+        <w:spacing w:after="40" w:before="0"/>
+      </w:pPr>
+      <w:r>
+        <w:rPr>
+          <w:b w:val="0"/>
+          <w:i w:val="0"/>
+        </w:rPr>
+        <w:t>1. 政策背景：教育部与广东省明令禁止幼儿园及培训机构提前教授小学英语内容，宝安区公办园基本不开英语课；民办园（尤其收费较高的园所）普遍每天 1 节外教"沉浸"课，但以儿歌、游戏、指令为主，不教认读。因此同一个班里孩子的起点差异很大，这是本课程要面对的第一现实。</w:t>
+      </w:r>
+    </w:p>
+    <w:p>
+      <w:pPr>
+        <w:spacing w:after="40" w:before="0"/>
+      </w:pPr>
+      <w:r>
+        <w:rPr>
+          <w:b w:val="0"/>
+          <w:i w:val="0"/>
+        </w:rPr>
+        <w:t>2. 普遍能做到（绝大多数孩子）：唱字母歌、认读 26 个大写字母名；会一些零散的儿歌词汇（颜色、1–10、几种动物、apple/banana 等食物）；听懂 Stand up / Sit down / Hello / Bye-bye 等课堂指令；愿意模仿、不怕开口。</w:t>
+      </w:r>
+    </w:p>
+    <w:p>
+      <w:pPr>
+        <w:spacing w:after="40" w:before="0"/>
+      </w:pPr>
+      <w:r>
+        <w:rPr>
+          <w:b w:val="0"/>
+          <w:i w:val="0"/>
+        </w:rPr>
+        <w:t>3. 普遍做不到（本课程的教学空间）：① 小写字母不熟，b/d、p/q、n/u 易混；② 只知字母名不知字母音（会说 "bee" 不会发 /b/），没有"音"的概念，更不会拼读；③ 不会握笔写字母，笔顺和在四线三格里定位都是零起点；④ 能说单词但说不出完整句子，What's your name? 之外的问句基本答不上；⑤ 没有独立"读"过一本英文书，不知道从左到右指读、不认识任何高频词。</w:t>
+      </w:r>
+    </w:p>
+    <w:p>
+      <w:pPr>
+        <w:spacing w:after="40" w:before="0"/>
+      </w:pPr>
+      <w:r>
+        <w:rPr>
+          <w:b w:val="0"/>
+          <w:i w:val="0"/>
+        </w:rPr>
+        <w:t>4. 衔接压力：深圳小学一年级统一使用沪教牛津 2024 新版教材，第一课不再教字母而直接进入词句对话（出现 magic、noodles、hungry 等词），而公办小学低年级英语每周只有 1–3 节课，2025 年秋季已引发"零基础孩子跟不上、每天哭"的家长热议。所以家长对本课程的真实期待是：孩子进小学时能听懂老师、敢开口说整句、认识字母音并能看着图读几句简单英文——而不是提前背小学单词。</w:t>
+      </w:r>
+    </w:p>
+    <w:p>
+      <w:pPr>
+        <w:spacing w:after="40" w:before="0"/>
+      </w:pPr>
+      <w:r>
+        <w:rPr>
+          <w:b w:val="0"/>
+          <w:i w:val="0"/>
+        </w:rPr>
+        <w:t>5. 6 岁的认知与行为特点：单次专注约 10–15 分钟，需要 TPR、换位、起立走动；喜欢规则清楚的竞争游戏和贴纸、印章类即时反馈；精细动作正在发展，适合描红但不宜大量抄写；已能理解"轮流、举手、排队"等小学常规，是幼小衔接训练的最佳窗口。</w:t>
+      </w:r>
+    </w:p>
+    <w:p>
+      <w:pPr>
+        <w:spacing w:after="40" w:before="0"/>
+      </w:pPr>
+      <w:r>
+        <w:rPr>
+          <w:b w:val="0"/>
+          <w:i w:val="0"/>
+        </w:rPr>
+        <w:t>6. 据此对原大纲的调整：① 字母名已会，L1–2 不再逐个教 A–Z，改为"字母快检 + 大小写配对 + 字母名 vs 字母音"，把节省的时间用于课堂常规建立与首音意识（alliteration）训练；② 每课 Starter 环节固定嵌入 1 条小学课堂常规（举手、排队、整理书包、听三步指令）；③ 书写从 L1 就开始抓握笔姿势和四线三格，但每课只描 1 页；④ 全程设"基础任务 / 挑战任务"两档，照顾有外教课基础与零基础的孩子；⑤ 期中、期末的书写项由"描红"改为"大小写配对 + 听音写字母"，口试加入 How old are you? 与"听音指字母"。</w:t>
       </w:r>
     </w:p>
     <w:p>
@@ -56,7 +144,7 @@
           <w:b w:val="0"/>
           <w:i w:val="0"/>
         </w:rPr>
-        <w:t>1. Starter 是主线，每单元 2 课。A 课：单元词汇 + Language in Use 核心句；B 课：颜色/数字/形状 + Sounds of English + 单元故事。45 分钟内固定四步：导入复习（5）→ 新词呈现与操练（15）→ 句型与互动（15）→ 游戏巩固 / 贴纸任务（10）。目标只有两个：会说生词、会用 1 个简单句。</w:t>
+        <w:t>1. Starter 是主线，每单元 2 课。A 课：单元词汇 + Language in Use 核心句；B 课：颜色/数字/形状 + Sounds of English + 单元故事。45 分钟内固定四步：导入复习（5）→ 新词呈现与操练（15）→ 句型与互动（15）→ 游戏巩固 / 贴纸任务（10）。目标只有两个：会说生词、会用 1 个完整的简单句（6 岁孩子完全可以要求"说整句"而不只是说词）。导入 5 分钟同时练 1 条小学课堂常规（见逐课表"常规"字样）。</w:t>
       </w:r>
     </w:p>
     <w:p>
@@ -68,7 +156,7 @@
           <w:b w:val="0"/>
           <w:i w:val="0"/>
         </w:rPr>
-        <w:t>2. 自然拼读 25 分钟，每课最多 2 个音，后半学期多为 1 个。顺序按"与当周 Starter 生词呼应"重排 Phonics 1 的单元；每课 25 分钟 = 音的呈现（5）→ Listen &amp; repeat 教材 5 词（5）→ 呼应词加入听辨（5）→ 游戏（10）。本学期只学到 Phonics 1 的一部分（ABC、p b t d、f v g l、s z m n、a e i o、硬 c k x、u、ch sh、h r、w ng），其余（软 c、y、th、j、软 g、wh、mb 及 3 个 Review）留到下学期配 Our World 1 继续。</w:t>
+        <w:t>2. 自然拼读 25 分钟，每课最多 2 个音，后半学期多为 1 个。孩子已会字母名，所以从 L1 起就反复强调"字母名 ≠ 字母音"（名字是 bee，声音是 /b/），用"字母卡正面名、背面音"的翻卡习惯贯穿全学期。顺序按"与当周 Starter 生词呼应"重排 Phonics 1 的单元；每课 25 分钟 = 音的呈现（5）→ Listen &amp; repeat 教材 5 词（5）→ 呼应词加入听辨（5）→ 游戏（10）。本学期只学到 Phonics 1 的一部分（ABC、p b t d、f v g l、s z m n、a e i o、硬 c k x、u、ch sh、h r、w ng），其余（软 c、y、th、j、软 g、wh、mb 及 3 个 Review）留到下学期配 Our World 1 继续。</w:t>
       </w:r>
     </w:p>
     <w:p>
@@ -92,7 +180,19 @@
           <w:b w:val="0"/>
           <w:i w:val="0"/>
         </w:rPr>
-        <w:t>4. 作业三件套，每课固定：Starter 音频跟唱（chant 或故事）、Phonics 描红一页、绘本朗读打卡（录音或视频，30 秒内）。打卡从该书第 2 次共读后开始。</w:t>
+        <w:t>4. 作业三件套，每课固定：Starter 音频跟唱（chant 或故事）、Phonics / Starter 字母描红一页（四线三格，强调握笔与笔顺，10 分钟内完成）、绘本朗读打卡（录音或视频，30 秒内）。打卡从该书第 2 次共读后开始。</w:t>
+      </w:r>
+    </w:p>
+    <w:p>
+      <w:pPr>
+        <w:spacing w:after="40" w:before="0"/>
+      </w:pPr>
+      <w:r>
+        <w:rPr>
+          <w:b w:val="0"/>
+          <w:i w:val="0"/>
+        </w:rPr>
+        <w:t>6. 分层：每课的巩固环节设两档任务。基础档——指图说词、跟读整句；挑战档——独立说整句、把句子换一个词（It's a red pen → It's a blue book）、绘本多读一页。有外教课基础的孩子做挑战档，零基础孩子完成基础档即得同样的贴纸，不做横向比较。</w:t>
       </w:r>
     </w:p>
     <w:p>
@@ -270,7 +370,7 @@
                 <w:b w:val="0"/>
                 <w:sz w:val="17"/>
               </w:rPr>
-              <w:t>ABC Unit p.2–3</w:t>
+              <w:t>ABC Unit p.2–3 + p.4–11 字母页</w:t>
             </w:r>
           </w:p>
         </w:tc>
@@ -288,7 +388,7 @@
                 <w:b w:val="0"/>
                 <w:sz w:val="17"/>
               </w:rPr>
-              <w:t>字母名 A–M（L1）、N–Z（L2）</w:t>
+              <w:t>L1：26 字母名快检、大小写配对、"名 vs 音"概念；L2：字母首音配对 A–Z（看图说首音，不拼读）</w:t>
             </w:r>
           </w:p>
         </w:tc>
@@ -306,7 +406,7 @@
                 <w:b w:val="0"/>
                 <w:sz w:val="17"/>
               </w:rPr>
-              <w:t>hello, book（只认字母名）</w:t>
+              <w:t>hello, book, red, two 的首字母与首音</w:t>
             </w:r>
           </w:p>
         </w:tc>
@@ -2511,7 +2611,7 @@
                 <w:b w:val="0"/>
                 <w:sz w:val="14"/>
               </w:rPr>
-              <w:t>导入(5) 问候歌 Hello Song、认识老师与规则</w:t>
+              <w:t>导入(5) 问候歌 Hello Song、认识老师；常规①：举手再说话（示范 + 练 3 次）</w:t>
             </w:r>
           </w:p>
           <w:p>
@@ -2523,7 +2623,7 @@
                 <w:b w:val="0"/>
                 <w:sz w:val="14"/>
               </w:rPr>
-              <w:t>新词(15) p.6–7 Hello / Goodbye；What's your name? I'm ___.（TR 0.1）用布偶示范，传球问答</w:t>
+              <w:t>新词(15) p.6–7 Hello / Goodbye；What's your name? I'm ___. How old are you? I'm six.（TR 0.1）用布偶示范，传球问答，要求说整句</w:t>
             </w:r>
           </w:p>
           <w:p>
@@ -2535,7 +2635,7 @@
                 <w:b w:val="0"/>
                 <w:sz w:val="14"/>
               </w:rPr>
-              <w:t>句型(15) 课堂指令 Stand up / Sit down / Open your book（TR 0.2）TPR + Simon says</w:t>
+              <w:t>句型(15) 课堂指令 Stand up / Sit down / Open your book / Line up（TR 0.2）TPR + Simon says</w:t>
             </w:r>
           </w:p>
           <w:p>
@@ -2547,7 +2647,7 @@
                 <w:b w:val="0"/>
                 <w:sz w:val="14"/>
               </w:rPr>
-              <w:t>巩固(10) 名字贴纸、Goodbye Song</w:t>
+              <w:t>巩固(10) 名字贴纸：在四线三格里描自己名字的首字母（握笔姿势示范）；Goodbye Song</w:t>
             </w:r>
           </w:p>
         </w:tc>
@@ -2565,7 +2665,7 @@
                 <w:b w:val="0"/>
                 <w:sz w:val="14"/>
               </w:rPr>
-              <w:t>ABC Unit p.2：字母歌 + 认读 A–M 大写字母名及配图词（apple, book, cat…）</w:t>
+              <w:t>字母快检(8)：p.2–3 字母歌一遍；26 张大写卡快闪，记录每个孩子不认识的字母（通常 0–3 个）</w:t>
             </w:r>
           </w:p>
           <w:p>
@@ -2577,7 +2677,19 @@
                 <w:b w:val="0"/>
                 <w:sz w:val="14"/>
               </w:rPr>
-              <w:t>游戏：字母寻宝——教室里贴 A–M 字母卡，听到字母名就跑去拍</w:t>
+              <w:t>大小写配对(7)：大写卡在地上、小写卡发给孩子，找"妈妈"；重点提示 b/d、p/q、n/u</w:t>
+            </w:r>
+          </w:p>
+          <w:p>
+            <w:pPr>
+              <w:spacing w:after="0" w:line="252" w:lineRule="auto"/>
+            </w:pPr>
+            <w:r>
+              <w:rPr>
+                <w:b w:val="0"/>
+                <w:sz w:val="14"/>
+              </w:rPr>
+              <w:t>名 vs 音(10)："字母有名字也有声音"——用 B/b 示范：名字 bee，声音 /b/，book 的开头；翻卡游戏：正面说名、背面说音（只做 B、P、M、S 四张）</w:t>
             </w:r>
           </w:p>
         </w:tc>
@@ -2595,7 +2707,7 @@
                 <w:b w:val="0"/>
                 <w:sz w:val="14"/>
               </w:rPr>
-              <w:t>hello, book（只认字母名）</w:t>
+              <w:t>book, pen, me, six 的首音</w:t>
             </w:r>
           </w:p>
         </w:tc>
@@ -2631,7 +2743,7 @@
                 <w:b w:val="0"/>
                 <w:sz w:val="14"/>
               </w:rPr>
-              <w:t>听 Hello Song；Phonics p.4 Aa 描红</w:t>
+              <w:t>听 Hello Song；Phonics p.4 Aa 大小写描红 1 页（家长拍握笔姿势照片）</w:t>
             </w:r>
           </w:p>
         </w:tc>
@@ -2669,7 +2781,7 @@
                 <w:b w:val="0"/>
                 <w:sz w:val="14"/>
               </w:rPr>
-              <w:t>导入(5) 问候 + 名字接龙</w:t>
+              <w:t>导入(5) 问候 + 名字接龙；常规②：听两步指令（Stand up and clap）</w:t>
             </w:r>
           </w:p>
           <w:p>
@@ -2681,7 +2793,7 @@
                 <w:b w:val="0"/>
                 <w:sz w:val="14"/>
               </w:rPr>
-              <w:t>新词(15) p.8 颜色 red / blue；数字 1、2（TR 0.3–0.5）彩色积木分类</w:t>
+              <w:t>新词(15) p.8 颜色 red / blue；数字 1、2（TR 0.3–0.5）彩色积木分类，说整句 It's red. / Two.</w:t>
             </w:r>
           </w:p>
           <w:p>
@@ -2693,7 +2805,7 @@
                 <w:b w:val="0"/>
                 <w:sz w:val="14"/>
               </w:rPr>
-              <w:t>句型(15) Sounds of English p.9：hello, goodbye 听辨（TR 0.6–0.8）；What's your name? 两人一组互问</w:t>
+              <w:t>句型(15) Sounds of English p.9：hello, goodbye 听辨（TR 0.6–0.8）；What's your name? / How old are you? 两人一组互问（挑战档：介绍同伴 This is ___.）</w:t>
             </w:r>
           </w:p>
           <w:p>
@@ -2705,7 +2817,7 @@
                 <w:b w:val="0"/>
                 <w:sz w:val="14"/>
               </w:rPr>
-              <w:t>巩固(10) 涂色：1 red, 2 blue</w:t>
+              <w:t>巩固(10) 涂色：1 red, 2 blue；在格子里描写 1、2</w:t>
             </w:r>
           </w:p>
         </w:tc>
@@ -2723,7 +2835,7 @@
                 <w:b w:val="0"/>
                 <w:sz w:val="14"/>
               </w:rPr>
-              <w:t>ABC Unit p.3：N–Z 字母名 + 整首字母歌</w:t>
+              <w:t>首音意识(15)：ABC Unit p.4–11 配图词，老师说词孩子说首字母并指卡（apple → A，book → B…）；只听首音、不拼读；重点体会：字母音是"短"的、字母名是"长"的</w:t>
             </w:r>
           </w:p>
           <w:p>
@@ -2735,7 +2847,7 @@
                 <w:b w:val="0"/>
                 <w:sz w:val="14"/>
               </w:rPr>
-              <w:t>游戏：字母 Hopscotch——地上摆 10 张字母卡，跳到哪张说哪张</w:t>
+              <w:t>游戏(10)：字母 Hopscotch 升级版——跳到哪张卡说"名 + 音 + 一个词"（会说音即可挑战）；p.2–3 字母歌最后一遍后收起字母歌，从 L3 起只说音</w:t>
             </w:r>
           </w:p>
         </w:tc>
@@ -2753,7 +2865,7 @@
                 <w:b w:val="0"/>
                 <w:sz w:val="14"/>
               </w:rPr>
-              <w:t>red, two（只认字母名）</w:t>
+              <w:t>red, blue, two 的首音 /r/ /b/ /t/</w:t>
             </w:r>
           </w:p>
         </w:tc>
@@ -2789,7 +2901,7 @@
                 <w:b w:val="0"/>
                 <w:sz w:val="14"/>
               </w:rPr>
-              <w:t>跟唱字母歌；B1 开始打卡（听音频跟读）</w:t>
+              <w:t>Phonics p.5 Bb 描红；B1 开始打卡（听音频跟读）</w:t>
             </w:r>
           </w:p>
         </w:tc>
@@ -2938,7 +3050,7 @@
                 <w:b w:val="0"/>
                 <w:sz w:val="14"/>
               </w:rPr>
-              <w:t>导入(5) 复习颜色数字；开篇大图 p.10–11 "What do you see?"</w:t>
+              <w:t>导入(5) 复习颜色数字；常规③：排队领材料（Line up, please）；开篇大图 p.10–11 "What do you see?"</w:t>
             </w:r>
           </w:p>
           <w:p>
@@ -2974,7 +3086,7 @@
                 <w:b w:val="0"/>
                 <w:sz w:val="14"/>
               </w:rPr>
-              <w:t>巩固(10) 猜物游戏：蒙眼摸真实文具</w:t>
+              <w:t>巩固(10) 猜物游戏：蒙眼摸真实文具（基础档：说词；挑战档：It's a red pen.）</w:t>
             </w:r>
           </w:p>
         </w:tc>
@@ -3108,7 +3220,7 @@
                 <w:b w:val="0"/>
                 <w:sz w:val="14"/>
               </w:rPr>
-              <w:t>导入(5) 文具词卡快闪 + What is it? 抢答</w:t>
+              <w:t>导入(5) 文具词卡快闪 + What is it? 抢答；常规④：整理书包与文具（Put your pencil in the bag）</w:t>
             </w:r>
           </w:p>
           <w:p>
@@ -3389,7 +3501,7 @@
                 <w:b w:val="0"/>
                 <w:sz w:val="14"/>
               </w:rPr>
-              <w:t>导入(5) 玩具箱亮相 "What is it?"</w:t>
+              <w:t>导入(5) 常规⑤：三步指令（Stand up, turn around, sit down）；玩具箱亮相 "What is it?"</w:t>
             </w:r>
           </w:p>
           <w:p>
@@ -3425,7 +3537,7 @@
                 <w:b w:val="0"/>
                 <w:sz w:val="14"/>
               </w:rPr>
-              <w:t>巩固(10) 贴纸配对、I'm a robot 机器人走路</w:t>
+              <w:t>巩固(10) 贴纸配对、I'm a robot 机器人走路（挑战档：Is it a big ball? 加形容词提问）</w:t>
             </w:r>
           </w:p>
         </w:tc>
@@ -3559,7 +3671,7 @@
                 <w:b w:val="0"/>
                 <w:sz w:val="14"/>
               </w:rPr>
-              <w:t>导入(5) Is it a ___? 快问快答</w:t>
+              <w:t>导入(5) Is it a ___? 快问快答；常规⑥：同伴轮流（Your turn / My turn），此后 6 条常规每课循环复现</w:t>
             </w:r>
           </w:p>
           <w:p>
@@ -7761,7 +7873,7 @@
           <w:b w:val="0"/>
           <w:i w:val="0"/>
         </w:rPr>
-        <w:t>面向 4–6 岁幼儿，无文字阅读题，听力均以图为选项。满分 100 = 集体听力 40 + 字母书写 10 + 一对一口试 50（口试含绘本朗读）。集体部分 20 分钟，口试每人约 3 分钟，老师边评边记。</w:t>
+        <w:t>面向 6 岁大班幼儿（已认识 26 个字母名），无文字阅读题，听力均以图为选项。满分 100 = 集体听力 40 + 字母书写 10 + 一对一口试 50（口试含绘本朗读）。集体部分 20 分钟，口试每人约 3 分钟，老师边评边记。</w:t>
       </w:r>
     </w:p>
     <w:tbl>
@@ -8279,7 +8391,7 @@
                 <w:b w:val="0"/>
                 <w:sz w:val="16"/>
               </w:rPr>
-              <w:t>5. Trace and write：描红 + 独立写；写名字</w:t>
+              <w:t>5. Match and write：大小写连线 + 听音写字母（老师发音，孩子在四线三格写出对应字母）+ 写名字</w:t>
             </w:r>
           </w:p>
         </w:tc>
@@ -8297,7 +8409,7 @@
                 <w:b w:val="0"/>
                 <w:sz w:val="16"/>
               </w:rPr>
-              <w:t>10</w:t>
+              <w:t>连线 4 + 听写 4 + 名字 2 = 10</w:t>
             </w:r>
           </w:p>
         </w:tc>
@@ -8315,7 +8427,7 @@
                 <w:b w:val="0"/>
                 <w:sz w:val="16"/>
               </w:rPr>
-              <w:t>Aa–Ll 中 6 个 + 名字首字母</w:t>
+              <w:t>连线 b/d、p/q、n/u、g/q 中 4 组；听写 p m s a 任 4 个；写名字首字母</w:t>
             </w:r>
           </w:p>
         </w:tc>
@@ -8333,7 +8445,7 @@
                 <w:b w:val="0"/>
                 <w:sz w:val="16"/>
               </w:rPr>
-              <w:t>Mm–Zz 中 6 个 + 完整名字</w:t>
+              <w:t>连线 4 组；听写 k sh（写 s h）w o 任 4 个；写完整名字（首字母大写）</w:t>
             </w:r>
           </w:p>
         </w:tc>
@@ -8407,7 +8519,7 @@
                 <w:b w:val="0"/>
                 <w:sz w:val="16"/>
               </w:rPr>
-              <w:t>问候 + What's your name?</w:t>
+              <w:t>问候 + What's your name? How old are you?（要求整句 I'm ___. I'm six.）</w:t>
             </w:r>
           </w:p>
         </w:tc>
@@ -8425,7 +8537,7 @@
                 <w:b w:val="0"/>
                 <w:sz w:val="16"/>
               </w:rPr>
-              <w:t>+ How old are you?（不扣分）</w:t>
+              <w:t>+ This is my ___.（指家人 / 同伴）</w:t>
             </w:r>
           </w:p>
         </w:tc>
@@ -8647,7 +8759,7 @@
                 <w:b w:val="0"/>
                 <w:sz w:val="16"/>
               </w:rPr>
-              <w:t>9. Say the sound：出示字母卡说音并举一词</w:t>
+              <w:t>9. Say the sound：出示字母卡说音（不说名）并举一词；再反过来老师说音孩子指字母</w:t>
             </w:r>
           </w:p>
         </w:tc>
@@ -8813,7 +8925,7 @@
           <w:b w:val="0"/>
           <w:i w:val="0"/>
         </w:rPr>
-        <w:t>口试用 ✓（独立完成）/ ○（提示后完成）/ △（需帮助）三级记录再折算；给家长的是五格成长卡（词汇、句型、字母、发音、朗读）而非分数。期中低于 60 分的孩子，在 L13–16 的导入 5 分钟内安排个别复习；绘本打卡连续 3 天未交的孩子，课上安排与老师一对一读 1 页。</w:t>
+        <w:t>口试用 ✓（独立完成）/ ○（提示后完成）/ △（需帮助）三级记录再折算；给家长的是五格成长卡（词汇、整句、字母音与书写、发音、朗读）而非分数，并附一句"距离小一新教材"的衔接说明（如：能听懂三步指令、能看图读 3 句）。期中低于 60 分的孩子，在 L13–16 的导入 5 分钟内安排个别复习；绘本打卡连续 3 天未交的孩子，课上安排与老师一对一读 1 页。</w:t>
       </w:r>
     </w:p>
     <w:p>

</xml_diff>